<commit_message>
Documentar la voz clonada de Qwen en DOCUMENTACION-TFM.docx (y .md, gitignorado)
</commit_message>
<xml_diff>
--- a/DOCUMENTACION-TFM.docx
+++ b/DOCUMENTACION-TFM.docx
@@ -113,7 +113,7 @@
         </w:rPr>
         <w:t xml:space="preserve">Narra la historia y decide qué enemigos aparecen, tomándolos de un catálogo real (334 monstruos, 319 hechizos, equipo y objetos mágicos, importados de </w:t>
       </w:r>
-      <w:hyperlink w:history="1" r:id="rIde4b7x_hwfxv5in9d-nmbr">
+      <w:hyperlink w:history="1" r:id="rIduuebxllo6ktnobb1vkpwp">
         <w:r>
           <w:rPr>
             <w:rStyle w:val="Hyperlink"/>
@@ -884,6 +884,46 @@
           <w:szCs w:val="18"/>
         </w:rPr>
         <w:t xml:space="preserve">npm run import:magic-items</w:t>
+      </w:r>
+    </w:p>
+    <w:p>
+      <w:pPr>
+        <w:spacing w:after="160"/>
+      </w:pPr>
+      <w:r>
+        <w:rPr>
+          <w:rFonts w:ascii="Calibri" w:cs="Calibri" w:eastAsia="Calibri" w:hAnsi="Calibri"/>
+          <w:sz w:val="22"/>
+          <w:szCs w:val="22"/>
+        </w:rPr>
+        <w:t xml:space="preserve"/>
+      </w:r>
+    </w:p>
+    <w:p>
+      <w:pPr>
+        <w:spacing w:after="160"/>
+      </w:pPr>
+      <w:r>
+        <w:rPr>
+          <w:rFonts w:ascii="Calibri" w:cs="Calibri" w:eastAsia="Calibri" w:hAnsi="Calibri"/>
+          <w:sz w:val="22"/>
+          <w:szCs w:val="22"/>
+        </w:rPr>
+        <w:t xml:space="preserve">Voz clonada (opcional, ver QWEN_TTS_CLONED_VOICE_ID en .env.example):</w:t>
+      </w:r>
+    </w:p>
+    <w:p>
+      <w:pPr>
+        <w:shd w:fill="F2F2F2" w:val="clear"/>
+        <w:spacing w:after="0"/>
+      </w:pPr>
+      <w:r>
+        <w:rPr>
+          <w:rFonts w:ascii="Consolas" w:cs="Consolas" w:eastAsia="Consolas" w:hAnsi="Consolas"/>
+          <w:sz w:val="18"/>
+          <w:szCs w:val="18"/>
+        </w:rPr>
+        <w:t xml:space="preserve">npm run clone-voice -- assets/voice-samples/mi-voz.wav</w:t>
       </w:r>
     </w:p>
     <w:p>
@@ -2513,15 +2553,15 @@
           <w:sz w:val="22"/>
           <w:szCs w:val="22"/>
         </w:rPr>
-        <w:t xml:space="preserve">Narración por voz (TTS)</w:t>
-      </w:r>
-      <w:r>
-        <w:rPr>
-          <w:rFonts w:ascii="Calibri" w:cs="Calibri" w:eastAsia="Calibri" w:hAnsi="Calibri"/>
-          <w:sz w:val="22"/>
-          <w:szCs w:val="22"/>
-        </w:rPr>
-        <w:t xml:space="preserve">: síntesis de la narración del DM con Qwen3-TTS-Flash (Alibaba Cloud), reproducible desde ui-web.</w:t>
+        <w:t xml:space="preserve">Narración por voz (TTS) con clonación de voz</w:t>
+      </w:r>
+      <w:r>
+        <w:rPr>
+          <w:rFonts w:ascii="Calibri" w:cs="Calibri" w:eastAsia="Calibri" w:hAnsi="Calibri"/>
+          <w:sz w:val="22"/>
+          <w:szCs w:val="22"/>
+        </w:rPr>
+        <w:t xml:space="preserve">: síntesis de la narración del DM con Qwen3-TTS-Flash (Alibaba Cloud), reproducible desde ui-web. Opcionalmente se puede clonar una voz real a partir de una muestra de audio propia (npm run clone-voice, scripts/clone-voice.ts) y usarla por defecto en vez de las voces del catálogo; el servicio cambia de modelo automáticamente al modelo VC dedicado de Qwen solo para esa voz.</w:t>
       </w:r>
     </w:p>
     <w:p>
@@ -3162,7 +3202,7 @@
         </w:rPr>
         <w:t xml:space="preserve">Enlaces: </w:t>
       </w:r>
-      <w:hyperlink w:history="1" r:id="rIdort_pwego0hlzu4nayt8s">
+      <w:hyperlink w:history="1" r:id="rIdmofanxfyczq-echb_ksca">
         <w:r>
           <w:rPr>
             <w:rStyle w:val="Hyperlink"/>
@@ -3181,7 +3221,7 @@
         </w:rPr>
         <w:t xml:space="preserve"> · </w:t>
       </w:r>
-      <w:hyperlink w:history="1" r:id="rIdg1yfxew3qrqfrc9d-5fl6">
+      <w:hyperlink w:history="1" r:id="rIdvbkvkgwjgcffw3fouhnpy">
         <w:r>
           <w:rPr>
             <w:rStyle w:val="Hyperlink"/>
@@ -3200,7 +3240,7 @@
         </w:rPr>
         <w:t xml:space="preserve"> · </w:t>
       </w:r>
-      <w:hyperlink w:history="1" r:id="rIdf17c_5waro7z3-gi8prxh">
+      <w:hyperlink w:history="1" r:id="rIddjjhpcpe56hqi1uxzqmqd">
         <w:r>
           <w:rPr>
             <w:rStyle w:val="Hyperlink"/>
@@ -3219,7 +3259,7 @@
         </w:rPr>
         <w:t xml:space="preserve"> · </w:t>
       </w:r>
-      <w:hyperlink w:history="1" r:id="rIdmfjmeyszsp873eki1jlok">
+      <w:hyperlink w:history="1" r:id="rIdfwotxswj0y3gfpza-l4vw">
         <w:r>
           <w:rPr>
             <w:rStyle w:val="Hyperlink"/>

</xml_diff>

<commit_message>
Seguridad: quitar contrasenas reales de prueba de README/DOCUMENTACION-TFM (repo publico)
</commit_message>
<xml_diff>
--- a/DOCUMENTACION-TFM.docx
+++ b/DOCUMENTACION-TFM.docx
@@ -113,7 +113,7 @@
         </w:rPr>
         <w:t xml:space="preserve">Narra la historia y decide qué enemigos aparecen, tomándolos de un catálogo real (334 monstruos, 319 hechizos, equipo y objetos mágicos, importados de </w:t>
       </w:r>
-      <w:hyperlink w:history="1" r:id="rIduuebxllo6ktnobb1vkpwp">
+      <w:hyperlink w:history="1" r:id="rIdz3tjl9ws1d0ce2hh37ov1">
         <w:r>
           <w:rPr>
             <w:rStyle w:val="Hyperlink"/>
@@ -2667,295 +2667,9 @@
           <w:sz w:val="22"/>
           <w:szCs w:val="22"/>
         </w:rPr>
-        <w:t xml:space="preserve">La API no permite registro público — estas cuentas ya existen en la base de datos de producción:</w:t>
-      </w:r>
-    </w:p>
-    <w:tbl>
-      <w:tblPr>
-        <w:tblW w:type="dxa" w:w="7000"/>
-        <w:tblBorders>
-          <w:top w:val="single" w:color="auto" w:sz="4"/>
-          <w:left w:val="single" w:color="auto" w:sz="4"/>
-          <w:bottom w:val="single" w:color="auto" w:sz="4"/>
-          <w:right w:val="single" w:color="auto" w:sz="4"/>
-          <w:insideH w:val="single" w:color="auto" w:sz="4"/>
-          <w:insideV w:val="single" w:color="auto" w:sz="4"/>
-        </w:tblBorders>
-      </w:tblPr>
-      <w:tblGrid>
-        <w:gridCol w:w="2500"/>
-        <w:gridCol w:w="2500"/>
-        <w:gridCol w:w="2000"/>
-      </w:tblGrid>
-      <w:tr>
-        <w:tc>
-          <w:tcPr>
-            <w:tcW w:type="dxa" w:w="2500"/>
-            <w:shd w:fill="DCE6F1" w:val="clear"/>
-          </w:tcPr>
-          <w:p>
-            <w:r>
-              <w:rPr>
-                <w:rFonts w:ascii="Calibri" w:cs="Calibri" w:eastAsia="Calibri" w:hAnsi="Calibri"/>
-                <w:b/>
-                <w:bCs/>
-                <w:sz w:val="20"/>
-                <w:szCs w:val="20"/>
-              </w:rPr>
-              <w:t xml:space="preserve">Usuario</w:t>
-            </w:r>
-          </w:p>
-        </w:tc>
-        <w:tc>
-          <w:tcPr>
-            <w:tcW w:type="dxa" w:w="2500"/>
-            <w:shd w:fill="DCE6F1" w:val="clear"/>
-          </w:tcPr>
-          <w:p>
-            <w:r>
-              <w:rPr>
-                <w:rFonts w:ascii="Calibri" w:cs="Calibri" w:eastAsia="Calibri" w:hAnsi="Calibri"/>
-                <w:b/>
-                <w:bCs/>
-                <w:sz w:val="20"/>
-                <w:szCs w:val="20"/>
-              </w:rPr>
-              <w:t xml:space="preserve">Contraseña</w:t>
-            </w:r>
-          </w:p>
-        </w:tc>
-        <w:tc>
-          <w:tcPr>
-            <w:tcW w:type="dxa" w:w="2000"/>
-            <w:shd w:fill="DCE6F1" w:val="clear"/>
-          </w:tcPr>
-          <w:p>
-            <w:r>
-              <w:rPr>
-                <w:rFonts w:ascii="Calibri" w:cs="Calibri" w:eastAsia="Calibri" w:hAnsi="Calibri"/>
-                <w:b/>
-                <w:bCs/>
-                <w:sz w:val="20"/>
-                <w:szCs w:val="20"/>
-              </w:rPr>
-              <w:t xml:space="preserve">Rol</w:t>
-            </w:r>
-          </w:p>
-        </w:tc>
-      </w:tr>
-      <w:tr>
-        <w:tc>
-          <w:tcPr>
-            <w:tcW w:type="dxa" w:w="2500"/>
-          </w:tcPr>
-          <w:p>
-            <w:r>
-              <w:rPr>
-                <w:rFonts w:ascii="Calibri" w:cs="Calibri" w:eastAsia="Calibri" w:hAnsi="Calibri"/>
-                <w:b w:val="false"/>
-                <w:bCs w:val="false"/>
-                <w:sz w:val="20"/>
-                <w:szCs w:val="20"/>
-              </w:rPr>
-              <w:t xml:space="preserve">carlos</w:t>
-            </w:r>
-          </w:p>
-        </w:tc>
-        <w:tc>
-          <w:tcPr>
-            <w:tcW w:type="dxa" w:w="2500"/>
-          </w:tcPr>
-          <w:p>
-            <w:r>
-              <w:rPr>
-                <w:rFonts w:ascii="Calibri" w:cs="Calibri" w:eastAsia="Calibri" w:hAnsi="Calibri"/>
-                <w:b w:val="false"/>
-                <w:bCs w:val="false"/>
-                <w:sz w:val="20"/>
-                <w:szCs w:val="20"/>
-              </w:rPr>
-              <w:t xml:space="preserve">@rquimed3s</w:t>
-            </w:r>
-          </w:p>
-        </w:tc>
-        <w:tc>
-          <w:tcPr>
-            <w:tcW w:type="dxa" w:w="2000"/>
-          </w:tcPr>
-          <w:p>
-            <w:r>
-              <w:rPr>
-                <w:rFonts w:ascii="Calibri" w:cs="Calibri" w:eastAsia="Calibri" w:hAnsi="Calibri"/>
-                <w:b w:val="false"/>
-                <w:bCs w:val="false"/>
-                <w:sz w:val="20"/>
-                <w:szCs w:val="20"/>
-              </w:rPr>
-              <w:t xml:space="preserve">admin</w:t>
-            </w:r>
-          </w:p>
-        </w:tc>
-      </w:tr>
-      <w:tr>
-        <w:tc>
-          <w:tcPr>
-            <w:tcW w:type="dxa" w:w="2500"/>
-          </w:tcPr>
-          <w:p>
-            <w:r>
-              <w:rPr>
-                <w:rFonts w:ascii="Calibri" w:cs="Calibri" w:eastAsia="Calibri" w:hAnsi="Calibri"/>
-                <w:b w:val="false"/>
-                <w:bCs w:val="false"/>
-                <w:sz w:val="20"/>
-                <w:szCs w:val="20"/>
-              </w:rPr>
-              <w:t xml:space="preserve">sergio@mail.com</w:t>
-            </w:r>
-          </w:p>
-        </w:tc>
-        <w:tc>
-          <w:tcPr>
-            <w:tcW w:type="dxa" w:w="2500"/>
-          </w:tcPr>
-          <w:p>
-            <w:r>
-              <w:rPr>
-                <w:rFonts w:ascii="Calibri" w:cs="Calibri" w:eastAsia="Calibri" w:hAnsi="Calibri"/>
-                <w:b w:val="false"/>
-                <w:bCs w:val="false"/>
-                <w:sz w:val="20"/>
-                <w:szCs w:val="20"/>
-              </w:rPr>
-              <w:t xml:space="preserve">S3rgi0</w:t>
-            </w:r>
-          </w:p>
-        </w:tc>
-        <w:tc>
-          <w:tcPr>
-            <w:tcW w:type="dxa" w:w="2000"/>
-          </w:tcPr>
-          <w:p>
-            <w:r>
-              <w:rPr>
-                <w:rFonts w:ascii="Calibri" w:cs="Calibri" w:eastAsia="Calibri" w:hAnsi="Calibri"/>
-                <w:b w:val="false"/>
-                <w:bCs w:val="false"/>
-                <w:sz w:val="20"/>
-                <w:szCs w:val="20"/>
-              </w:rPr>
-              <w:t xml:space="preserve">jugador</w:t>
-            </w:r>
-          </w:p>
-        </w:tc>
-      </w:tr>
-      <w:tr>
-        <w:tc>
-          <w:tcPr>
-            <w:tcW w:type="dxa" w:w="2500"/>
-          </w:tcPr>
-          <w:p>
-            <w:r>
-              <w:rPr>
-                <w:rFonts w:ascii="Calibri" w:cs="Calibri" w:eastAsia="Calibri" w:hAnsi="Calibri"/>
-                <w:b w:val="false"/>
-                <w:bCs w:val="false"/>
-                <w:sz w:val="20"/>
-                <w:szCs w:val="20"/>
-              </w:rPr>
-              <w:t xml:space="preserve">sandra@mail.com</w:t>
-            </w:r>
-          </w:p>
-        </w:tc>
-        <w:tc>
-          <w:tcPr>
-            <w:tcW w:type="dxa" w:w="2500"/>
-          </w:tcPr>
-          <w:p>
-            <w:r>
-              <w:rPr>
-                <w:rFonts w:ascii="Calibri" w:cs="Calibri" w:eastAsia="Calibri" w:hAnsi="Calibri"/>
-                <w:b w:val="false"/>
-                <w:bCs w:val="false"/>
-                <w:sz w:val="20"/>
-                <w:szCs w:val="20"/>
-              </w:rPr>
-              <w:t xml:space="preserve">S@ndra83</w:t>
-            </w:r>
-          </w:p>
-        </w:tc>
-        <w:tc>
-          <w:tcPr>
-            <w:tcW w:type="dxa" w:w="2000"/>
-          </w:tcPr>
-          <w:p>
-            <w:r>
-              <w:rPr>
-                <w:rFonts w:ascii="Calibri" w:cs="Calibri" w:eastAsia="Calibri" w:hAnsi="Calibri"/>
-                <w:b w:val="false"/>
-                <w:bCs w:val="false"/>
-                <w:sz w:val="20"/>
-                <w:szCs w:val="20"/>
-              </w:rPr>
-              <w:t xml:space="preserve">jugador</w:t>
-            </w:r>
-          </w:p>
-        </w:tc>
-      </w:tr>
-      <w:tr>
-        <w:tc>
-          <w:tcPr>
-            <w:tcW w:type="dxa" w:w="2500"/>
-          </w:tcPr>
-          <w:p>
-            <w:r>
-              <w:rPr>
-                <w:rFonts w:ascii="Calibri" w:cs="Calibri" w:eastAsia="Calibri" w:hAnsi="Calibri"/>
-                <w:b w:val="false"/>
-                <w:bCs w:val="false"/>
-                <w:sz w:val="20"/>
-                <w:szCs w:val="20"/>
-              </w:rPr>
-              <w:t xml:space="preserve">checa@mail.com</w:t>
-            </w:r>
-          </w:p>
-        </w:tc>
-        <w:tc>
-          <w:tcPr>
-            <w:tcW w:type="dxa" w:w="2500"/>
-          </w:tcPr>
-          <w:p>
-            <w:r>
-              <w:rPr>
-                <w:rFonts w:ascii="Calibri" w:cs="Calibri" w:eastAsia="Calibri" w:hAnsi="Calibri"/>
-                <w:b w:val="false"/>
-                <w:bCs w:val="false"/>
-                <w:sz w:val="20"/>
-                <w:szCs w:val="20"/>
-              </w:rPr>
-              <w:t xml:space="preserve">Ch3k@81</w:t>
-            </w:r>
-          </w:p>
-        </w:tc>
-        <w:tc>
-          <w:tcPr>
-            <w:tcW w:type="dxa" w:w="2000"/>
-          </w:tcPr>
-          <w:p>
-            <w:r>
-              <w:rPr>
-                <w:rFonts w:ascii="Calibri" w:cs="Calibri" w:eastAsia="Calibri" w:hAnsi="Calibri"/>
-                <w:b w:val="false"/>
-                <w:bCs w:val="false"/>
-                <w:sz w:val="20"/>
-                <w:szCs w:val="20"/>
-              </w:rPr>
-              <w:t xml:space="preserve">jugador</w:t>
-            </w:r>
-          </w:p>
-        </w:tc>
-      </w:tr>
-    </w:tbl>
+        <w:t xml:space="preserve">La API no permite registro público — existen 4 cuentas de prueba en la base de datos de producción (1 admin + 3 jugador), pensadas para probar el flujo completo con varios jugadores a la vez en la misma partida (crear personaje, sala de espera, turnos) desde sesiones distintas.</w:t>
+      </w:r>
+    </w:p>
     <w:p>
       <w:pPr>
         <w:spacing w:after="160"/>
@@ -2966,7 +2680,7 @@
           <w:sz w:val="22"/>
           <w:szCs w:val="22"/>
         </w:rPr>
-        <w:t xml:space="preserve">Cualquiera de las cuatro sirve para entrar tanto en ui-web como en mobile-app. Para probar el flujo completo con varios jugadores en la misma partida (crear personaje, sala de espera, turnos), se recomienda usar dos cuentas a la vez desde dos sesiones distintas.</w:t>
+        <w:t xml:space="preserve">Por seguridad, las credenciales reales no se publican en este documento (vive en un repositorio público) — se facilitan por un canal privado aparte (correo/entrega directa). Si necesitas acceso, pide las credenciales de evaluación en lugar de buscarlas aquí.</w:t>
       </w:r>
     </w:p>
     <w:p>
@@ -3202,7 +2916,7 @@
         </w:rPr>
         <w:t xml:space="preserve">Enlaces: </w:t>
       </w:r>
-      <w:hyperlink w:history="1" r:id="rIdmofanxfyczq-echb_ksca">
+      <w:hyperlink w:history="1" r:id="rIdqxrqmumktuqgpcrjhjbzp">
         <w:r>
           <w:rPr>
             <w:rStyle w:val="Hyperlink"/>
@@ -3221,7 +2935,7 @@
         </w:rPr>
         <w:t xml:space="preserve"> · </w:t>
       </w:r>
-      <w:hyperlink w:history="1" r:id="rIdvbkvkgwjgcffw3fouhnpy">
+      <w:hyperlink w:history="1" r:id="rIds4khj9ogsnassw4lphgt5">
         <w:r>
           <w:rPr>
             <w:rStyle w:val="Hyperlink"/>
@@ -3240,7 +2954,7 @@
         </w:rPr>
         <w:t xml:space="preserve"> · </w:t>
       </w:r>
-      <w:hyperlink w:history="1" r:id="rIddjjhpcpe56hqi1uxzqmqd">
+      <w:hyperlink w:history="1" r:id="rIdghkc8wqzqx0vqyxxkllcb">
         <w:r>
           <w:rPr>
             <w:rStyle w:val="Hyperlink"/>
@@ -3259,7 +2973,7 @@
         </w:rPr>
         <w:t xml:space="preserve"> · </w:t>
       </w:r>
-      <w:hyperlink w:history="1" r:id="rIdfwotxswj0y3gfpza-l4vw">
+      <w:hyperlink w:history="1" r:id="rIdayc5cq0nmz2vaksfni6bz">
         <w:r>
           <w:rPr>
             <w:rStyle w:val="Hyperlink"/>

</xml_diff>